<commit_message>
Leno: revisão Parte 2
Co-Authored-By: Claude Opus 5.5 <noreply@anthropic.com>
Claude-Session: https://claude.ai/code/session_01MJjUEEZrxQDEUifKK2vj9g
</commit_message>
<xml_diff>
--- a/roteiros/leno/Leno_Parte2.docx
+++ b/roteiros/leno/Leno_Parte2.docx
@@ -135,7 +135,7 @@
         <w:rPr>
           <w:color w:val="C00000"/>
         </w:rPr>
-        <w:t>Guarde esse nome também. "A Pobreza". Porque, poucos anos depois, Leno ia descobrir que ser ídolo não protegia ninguém. E que a gravadora que aplaudia aquele sucesso ia ser a primeira a fechar a porta na cara dele.</w:t>
+        <w:t>Leno tinha dezenove anos e um primeiro lugar nas rádios. Em menos de três anos, a mesma gravadora que aplaudia aquele sucesso ia ameaçar apagar o trabalho mais importante da vida dele.</w:t>
       </w:r>
     </w:p>
     <w:p>
@@ -199,14 +199,6 @@
         <w:rPr>
           <w:color w:val="000000"/>
         </w:rPr>
-        <w:t>O rapaz se apresentou. Disse que estava ali com a banda dele, Os Panteras.</w:t>
-      </w:r>
-    </w:p>
-    <w:p>
-      <w:r>
-        <w:rPr>
-          <w:color w:val="000000"/>
-        </w:rPr>
         <w:t>O nome dele era Raul Seixas.</w:t>
       </w:r>
     </w:p>
@@ -215,7 +207,7 @@
         <w:rPr>
           <w:color w:val="000000"/>
         </w:rPr>
-        <w:t>Naquele tempo, quase ninguém fora da Bahia sabia quem era Raul Seixas. Leno lembrava dele como um sujeito muito engraçado, que não parava quieto. Naquela mesma noite, Raul chegou a pular do palco para defender Jerry Adriani numa confusão com gente da plateia.</w:t>
+        <w:t>Naquele tempo, quase ninguém fora da Bahia sabia quem era Raul Seixas. Leno lembrava dele como um sujeito muito engraçado, que não parava quieto. Leno também lembrava de ver Raul pular do palco para ajudar Jerry Adriani numa confusão com gente da plateia.</w:t>
       </w:r>
     </w:p>
     <w:p>
@@ -263,7 +255,7 @@
         <w:rPr>
           <w:color w:val="000000"/>
         </w:rPr>
-        <w:t>Pela primeira vez, o nome de Leno na capa não bastava para vender um disco. O público da Jovem Guarda estava crescendo. A própria Jovem Guarda tinha saído do ar. E um cantor de baladas românticas para adolescentes, de repente, não sabia mais para quem cantar.</w:t>
+        <w:t>Pela primeira vez, o nome de Leno na capa não bastava para vender um disco. Os fãs da Jovem Guarda estavam virando adultos. A própria Jovem Guarda tinha saído do ar. E um cantor de baladas românticas para adolescentes, de repente, não sabia mais para quem cantar.</w:t>
       </w:r>
     </w:p>
     <w:p>
@@ -311,7 +303,7 @@
         <w:rPr>
           <w:color w:val="000000"/>
         </w:rPr>
-        <w:t>Uma das primeiras músicas da parceria foi gravada pelos Blue Caps. O título dizia muito sobre o que os dois sentiam naquele momento.</w:t>
+        <w:t>Uma das primeiras músicas da parceria foi gravada pelos Blue Caps. Hoje, aquele título soa quase como um aviso.</w:t>
       </w:r>
     </w:p>
     <w:p>
@@ -367,7 +359,7 @@
         <w:rPr>
           <w:color w:val="000000"/>
         </w:rPr>
-        <w:t>Com ele, o Congresso foi fechado. O habeas corpus foi suspenso para crimes políticos. E a censura passou a controlar o que se publicava, o que passava na televisão e o que se cantava.</w:t>
+        <w:t>Com ele, o Congresso foi fechado. O habeas corpus foi suspenso para crimes políticos. E a censura passou a controlar até o que se cantava.</w:t>
       </w:r>
     </w:p>
     <w:p>
@@ -423,7 +415,7 @@
         <w:rPr>
           <w:color w:val="000000"/>
         </w:rPr>
-        <w:t>Leno chamou músicos de todo lado. A banda A Bolha, uma das mais pesadas do rock carioca. Os Blue Caps, de Renato Barros. E até o grupo uruguaio Los Shakers.</w:t>
+        <w:t>Leno chamou a banda A Bolha, uma das mais pesadas do rock carioca, e os Blue Caps de Renato Barros. Chamou até o grupo uruguaio Los Shakers.</w:t>
       </w:r>
     </w:p>
     <w:p>
@@ -487,7 +479,7 @@
         <w:rPr>
           <w:color w:val="000000"/>
         </w:rPr>
-        <w:t>Esse nome é o terceiro objeto dessa história. Parece só uma brincadeira de um rapaz apaixonado pelos Beatles.</w:t>
+        <w:t>Parecia só a brincadeira de um rapaz apaixonado pelos Beatles.</w:t>
       </w:r>
     </w:p>
     <w:p>
@@ -495,7 +487,7 @@
         <w:rPr>
           <w:color w:val="C00000"/>
         </w:rPr>
-        <w:t>Mas guarde esse nome com muito cuidado. Porque, no fim dessa história, ele vai ganhar um peso que Leno nunca poderia ter imaginado.</w:t>
+        <w:t>Por que um nome inventado quase por brincadeira ia, cinquenta e um anos depois, deixar arrepiado quem conhece essa história?</w:t>
       </w:r>
     </w:p>
     <w:p>

</xml_diff>

<commit_message>
Leno: revisão geral e pacote de produção
Co-Authored-By: Claude Opus 5.5 <noreply@anthropic.com>
Claude-Session: https://claude.ai/code/session_01MJjUEEZrxQDEUifKK2vj9g
</commit_message>
<xml_diff>
--- a/roteiros/leno/Leno_Parte2.docx
+++ b/roteiros/leno/Leno_Parte2.docx
@@ -439,7 +439,7 @@
         <w:rPr>
           <w:color w:val="000000"/>
         </w:rPr>
-        <w:t>Esse é o segundo objeto dessa história. A fita de rolo onde aquele disco foi gravado, com treze músicas e três meses de trabalho dentro do estúdio da CBS.</w:t>
+        <w:t>Guarde a imagem da fita de rolo onde aquele disco foi gravado. Treze músicas e três meses de trabalho dentro do estúdio da CBS, enrolados numa bobina.</w:t>
       </w:r>
     </w:p>
     <w:p>
@@ -447,7 +447,7 @@
         <w:rPr>
           <w:color w:val="C00000"/>
         </w:rPr>
-        <w:t>Lembre dessa fita. Porque o que aconteceu com ela é o centro de toda essa história. E a resposta só ia aparecer décadas depois, num lugar onde ninguém pensou em procurar.</w:t>
+        <w:t>O que aconteceu com essa fita é o centro de toda essa história. E a resposta só ia aparecer décadas depois, num lugar onde ninguém pensou em procurar.</w:t>
       </w:r>
     </w:p>
     <w:p>

</xml_diff>